<commit_message>
Embed H2 console screenshots in write-up doc
Replace the screenshot placeholders with the real H2 console
captures: empty USER/TRANSACTION tables right after startup, and
the same tables populated after registering two users and sending
money between them.
</commit_message>
<xml_diff>
--- a/PayFlow_WriteUp.docx
+++ b/PayFlow_WriteUp.docx
@@ -94,25 +94,104 @@
     </w:p>
     <w:p>
       <w:pPr>
-        <w:ind w:left="432"/>
+        <w:jc w:val="center"/>
+      </w:pPr>
+      <w:r>
+        <w:drawing>
+          <wp:inline xmlns:a="http://schemas.openxmlformats.org/drawingml/2006/main" xmlns:pic="http://schemas.openxmlformats.org/drawingml/2006/picture">
+            <wp:extent cx="5486400" cy="3303270"/>
+            <wp:docPr id="1" name="Picture 1"/>
+            <wp:cNvGraphicFramePr>
+              <a:graphicFrameLocks noChangeAspect="1"/>
+            </wp:cNvGraphicFramePr>
+            <a:graphic>
+              <a:graphicData uri="http://schemas.openxmlformats.org/drawingml/2006/picture">
+                <pic:pic>
+                  <pic:nvPicPr>
+                    <pic:cNvPr id="0" name="ss_1.png"/>
+                    <pic:cNvPicPr/>
+                  </pic:nvPicPr>
+                  <pic:blipFill>
+                    <a:blip r:embed="rId9"/>
+                    <a:stretch>
+                      <a:fillRect/>
+                    </a:stretch>
+                  </pic:blipFill>
+                  <pic:spPr>
+                    <a:xfrm>
+                      <a:off x="0" y="0"/>
+                      <a:ext cx="5486400" cy="3303270"/>
+                    </a:xfrm>
+                    <a:prstGeom prst="rect"/>
+                  </pic:spPr>
+                </pic:pic>
+              </a:graphicData>
+            </a:graphic>
+          </wp:inline>
+        </w:drawing>
+      </w:r>
+    </w:p>
+    <w:p>
+      <w:pPr>
+        <w:jc w:val="center"/>
       </w:pPr>
       <w:r>
         <w:rPr>
           <w:i/>
+          <w:sz w:val="18"/>
         </w:rPr>
-        <w:t>[ Insert screenshot: SELECT * FROM USER; -- empty table ]</w:t>
+        <w:t>SELECT * FROM USER; -- empty table</w:t>
       </w:r>
     </w:p>
-    <w:p/>
     <w:p>
       <w:pPr>
-        <w:ind w:left="432"/>
+        <w:jc w:val="center"/>
+      </w:pPr>
+      <w:r>
+        <w:drawing>
+          <wp:inline xmlns:a="http://schemas.openxmlformats.org/drawingml/2006/main" xmlns:pic="http://schemas.openxmlformats.org/drawingml/2006/picture">
+            <wp:extent cx="5486400" cy="3284220"/>
+            <wp:docPr id="2" name="Picture 2"/>
+            <wp:cNvGraphicFramePr>
+              <a:graphicFrameLocks noChangeAspect="1"/>
+            </wp:cNvGraphicFramePr>
+            <a:graphic>
+              <a:graphicData uri="http://schemas.openxmlformats.org/drawingml/2006/picture">
+                <pic:pic>
+                  <pic:nvPicPr>
+                    <pic:cNvPr id="0" name="ss_2.png"/>
+                    <pic:cNvPicPr/>
+                  </pic:nvPicPr>
+                  <pic:blipFill>
+                    <a:blip r:embed="rId10"/>
+                    <a:stretch>
+                      <a:fillRect/>
+                    </a:stretch>
+                  </pic:blipFill>
+                  <pic:spPr>
+                    <a:xfrm>
+                      <a:off x="0" y="0"/>
+                      <a:ext cx="5486400" cy="3284220"/>
+                    </a:xfrm>
+                    <a:prstGeom prst="rect"/>
+                  </pic:spPr>
+                </pic:pic>
+              </a:graphicData>
+            </a:graphic>
+          </wp:inline>
+        </w:drawing>
+      </w:r>
+    </w:p>
+    <w:p>
+      <w:pPr>
+        <w:jc w:val="center"/>
       </w:pPr>
       <w:r>
         <w:rPr>
           <w:i/>
+          <w:sz w:val="18"/>
         </w:rPr>
-        <w:t>[ Insert screenshot: SELECT * FROM TRANSACTION; -- empty table ]</w:t>
+        <w:t>SELECT * FROM TRANSACTION; -- empty table</w:t>
       </w:r>
     </w:p>
     <w:p>
@@ -412,25 +491,104 @@
     </w:p>
     <w:p>
       <w:pPr>
-        <w:ind w:left="432"/>
+        <w:jc w:val="center"/>
+      </w:pPr>
+      <w:r>
+        <w:drawing>
+          <wp:inline xmlns:a="http://schemas.openxmlformats.org/drawingml/2006/main" xmlns:pic="http://schemas.openxmlformats.org/drawingml/2006/picture">
+            <wp:extent cx="5486400" cy="3276600"/>
+            <wp:docPr id="3" name="Picture 3"/>
+            <wp:cNvGraphicFramePr>
+              <a:graphicFrameLocks noChangeAspect="1"/>
+            </wp:cNvGraphicFramePr>
+            <a:graphic>
+              <a:graphicData uri="http://schemas.openxmlformats.org/drawingml/2006/picture">
+                <pic:pic>
+                  <pic:nvPicPr>
+                    <pic:cNvPr id="0" name="ss_3.png"/>
+                    <pic:cNvPicPr/>
+                  </pic:nvPicPr>
+                  <pic:blipFill>
+                    <a:blip r:embed="rId11"/>
+                    <a:stretch>
+                      <a:fillRect/>
+                    </a:stretch>
+                  </pic:blipFill>
+                  <pic:spPr>
+                    <a:xfrm>
+                      <a:off x="0" y="0"/>
+                      <a:ext cx="5486400" cy="3276600"/>
+                    </a:xfrm>
+                    <a:prstGeom prst="rect"/>
+                  </pic:spPr>
+                </pic:pic>
+              </a:graphicData>
+            </a:graphic>
+          </wp:inline>
+        </w:drawing>
+      </w:r>
+    </w:p>
+    <w:p>
+      <w:pPr>
+        <w:jc w:val="center"/>
       </w:pPr>
       <w:r>
         <w:rPr>
           <w:i/>
+          <w:sz w:val="18"/>
         </w:rPr>
-        <w:t>[ Insert screenshot: SELECT * FROM USER; -- two rows ]</w:t>
+        <w:t>SELECT * FROM USER; -- two rows</w:t>
       </w:r>
     </w:p>
-    <w:p/>
     <w:p>
       <w:pPr>
-        <w:ind w:left="432"/>
+        <w:jc w:val="center"/>
+      </w:pPr>
+      <w:r>
+        <w:drawing>
+          <wp:inline xmlns:a="http://schemas.openxmlformats.org/drawingml/2006/main" xmlns:pic="http://schemas.openxmlformats.org/drawingml/2006/picture">
+            <wp:extent cx="5486400" cy="3272790"/>
+            <wp:docPr id="4" name="Picture 4"/>
+            <wp:cNvGraphicFramePr>
+              <a:graphicFrameLocks noChangeAspect="1"/>
+            </wp:cNvGraphicFramePr>
+            <a:graphic>
+              <a:graphicData uri="http://schemas.openxmlformats.org/drawingml/2006/picture">
+                <pic:pic>
+                  <pic:nvPicPr>
+                    <pic:cNvPr id="0" name="ss_4.png"/>
+                    <pic:cNvPicPr/>
+                  </pic:nvPicPr>
+                  <pic:blipFill>
+                    <a:blip r:embed="rId12"/>
+                    <a:stretch>
+                      <a:fillRect/>
+                    </a:stretch>
+                  </pic:blipFill>
+                  <pic:spPr>
+                    <a:xfrm>
+                      <a:off x="0" y="0"/>
+                      <a:ext cx="5486400" cy="3272790"/>
+                    </a:xfrm>
+                    <a:prstGeom prst="rect"/>
+                  </pic:spPr>
+                </pic:pic>
+              </a:graphicData>
+            </a:graphic>
+          </wp:inline>
+        </w:drawing>
+      </w:r>
+    </w:p>
+    <w:p>
+      <w:pPr>
+        <w:jc w:val="center"/>
       </w:pPr>
       <w:r>
         <w:rPr>
           <w:i/>
+          <w:sz w:val="18"/>
         </w:rPr>
-        <w:t>[ Insert screenshot: SELECT * FROM TRANSACTION; -- one row ]</w:t>
+        <w:t>SELECT * FROM TRANSACTION; -- one row</w:t>
       </w:r>
     </w:p>
     <w:p>

</xml_diff>